<commit_message>
update project status form with team details, project title, and objectives
</commit_message>
<xml_diff>
--- a/AAI-500 Final Team Project Status Update Form.docx
+++ b/AAI-500 Final Team Project Status Update Form.docx
@@ -1,117 +1,122 @@
 
 <file path=word/document.xml><?xml version="1.0" encoding="utf-8"?>
-<w:document xmlns:mc="http://schemas.openxmlformats.org/markup-compatibility/2006" xmlns:o="urn:schemas-microsoft-com:office:office" xmlns:r="http://schemas.openxmlformats.org/officeDocument/2006/relationships" xmlns:m="http://schemas.openxmlformats.org/officeDocument/2006/math" xmlns:v="urn:schemas-microsoft-com:vml" xmlns:wp="http://schemas.openxmlformats.org/drawingml/2006/wordprocessingDrawing" xmlns:w10="urn:schemas-microsoft-com:office:word" xmlns:w="http://schemas.openxmlformats.org/wordprocessingml/2006/main" xmlns:wne="http://schemas.microsoft.com/office/word/2006/wordml" xmlns:sl="http://schemas.openxmlformats.org/schemaLibrary/2006/main" xmlns:a="http://schemas.openxmlformats.org/drawingml/2006/main" xmlns:pic="http://schemas.openxmlformats.org/drawingml/2006/picture" xmlns:c="http://schemas.openxmlformats.org/drawingml/2006/chart" xmlns:lc="http://schemas.openxmlformats.org/drawingml/2006/lockedCanvas" xmlns:dgm="http://schemas.openxmlformats.org/drawingml/2006/diagram" xmlns:wps="http://schemas.microsoft.com/office/word/2010/wordprocessingShape" xmlns:wpg="http://schemas.microsoft.com/office/word/2010/wordprocessingGroup" xmlns:w14="http://schemas.microsoft.com/office/word/2010/wordml" xmlns:w15="http://schemas.microsoft.com/office/word/2012/wordml">
+<w:document xmlns:wpc="http://schemas.microsoft.com/office/word/2010/wordprocessingCanvas" xmlns:mc="http://schemas.openxmlformats.org/markup-compatibility/2006" xmlns:o="urn:schemas-microsoft-com:office:office" xmlns:r="http://schemas.openxmlformats.org/officeDocument/2006/relationships" xmlns:m="http://schemas.openxmlformats.org/officeDocument/2006/math" xmlns:v="urn:schemas-microsoft-com:vml" xmlns:wp14="http://schemas.microsoft.com/office/word/2010/wordprocessingDrawing" xmlns:wp="http://schemas.openxmlformats.org/drawingml/2006/wordprocessingDrawing" xmlns:w10="urn:schemas-microsoft-com:office:word" xmlns:w="http://schemas.openxmlformats.org/wordprocessingml/2006/main" xmlns:w14="http://schemas.microsoft.com/office/word/2010/wordml" xmlns:w15="http://schemas.microsoft.com/office/word/2012/wordml" xmlns:w16se="http://schemas.microsoft.com/office/word/2015/wordml/symex" xmlns:w16cid="http://schemas.microsoft.com/office/word/2016/wordml/cid" xmlns:w16="http://schemas.microsoft.com/office/word/2018/wordml" xmlns:w16cex="http://schemas.microsoft.com/office/word/2018/wordml/cex" xmlns:w16sdtdh="http://schemas.microsoft.com/office/word/2020/wordml/sdtdatahash" xmlns:wne="http://schemas.microsoft.com/office/word/2006/wordml" xmlns:wpg="http://schemas.microsoft.com/office/word/2010/wordprocessingGroup" xmlns:wps="http://schemas.microsoft.com/office/word/2010/wordprocessingShape" mc:Ignorable="w14 w15 w16se w16cid w16 w16cex w16sdtdh wp14">
   <w:body>
     <w:p>
       <w:pPr>
         <w:jc w:val="center"/>
         <w:rPr>
-          <w:rFonts w:ascii="Times New Roman" w:cs="Times New Roman" w:eastAsia="Times New Roman" w:hAnsi="Times New Roman"/>
-          <w:b w:val="1"/>
-        </w:rPr>
-      </w:pPr>
-      <w:r>
-        <w:rPr>
-          <w:rFonts w:ascii="Times New Roman" w:cs="Times New Roman" w:eastAsia="Times New Roman" w:hAnsi="Times New Roman"/>
-          <w:b w:val="1"/>
-          <w:rtl w:val="0"/>
-        </w:rPr>
-        <w:t xml:space="preserve">AAI-500 – Team Project Status Update Form</w:t>
-      </w:r>
-      <w:r>
-        <w:rPr>
-          <w:rtl w:val="0"/>
-        </w:rPr>
-      </w:r>
-    </w:p>
-    <w:p>
-      <w:pPr>
-        <w:rPr>
-          <w:rFonts w:ascii="Times New Roman" w:cs="Times New Roman" w:eastAsia="Times New Roman" w:hAnsi="Times New Roman"/>
-        </w:rPr>
-      </w:pPr>
-      <w:r>
-        <w:rPr>
-          <w:rtl w:val="0"/>
-        </w:rPr>
-      </w:r>
-    </w:p>
-    <w:p>
-      <w:pPr>
-        <w:spacing w:line="276" w:lineRule="auto"/>
-        <w:rPr>
-          <w:rFonts w:ascii="Times New Roman" w:cs="Times New Roman" w:eastAsia="Times New Roman" w:hAnsi="Times New Roman"/>
-        </w:rPr>
-      </w:pPr>
-      <w:r>
-        <w:rPr>
-          <w:rFonts w:ascii="Times New Roman" w:cs="Times New Roman" w:eastAsia="Times New Roman" w:hAnsi="Times New Roman"/>
-          <w:rtl w:val="0"/>
-        </w:rPr>
-        <w:t xml:space="preserve">Fill out this form and submit it by the end of Module 4 in Blackboard.</w:t>
-      </w:r>
-    </w:p>
-    <w:p>
-      <w:pPr>
-        <w:spacing w:line="276" w:lineRule="auto"/>
-        <w:rPr>
-          <w:rFonts w:ascii="Times New Roman" w:cs="Times New Roman" w:eastAsia="Times New Roman" w:hAnsi="Times New Roman"/>
-        </w:rPr>
-      </w:pPr>
-      <w:r>
-        <w:rPr>
-          <w:rtl w:val="0"/>
-        </w:rPr>
-      </w:r>
-    </w:p>
-    <w:p>
-      <w:pPr>
-        <w:spacing w:line="276" w:lineRule="auto"/>
-        <w:rPr>
-          <w:rFonts w:ascii="Times New Roman" w:cs="Times New Roman" w:eastAsia="Times New Roman" w:hAnsi="Times New Roman"/>
-        </w:rPr>
-      </w:pPr>
-      <w:r>
-        <w:rPr>
-          <w:rFonts w:ascii="Times New Roman" w:cs="Times New Roman" w:eastAsia="Times New Roman" w:hAnsi="Times New Roman"/>
-          <w:rtl w:val="0"/>
-        </w:rPr>
-        <w:t xml:space="preserve">Team Number: _____________</w:t>
-      </w:r>
-    </w:p>
-    <w:p>
-      <w:pPr>
-        <w:spacing w:line="276" w:lineRule="auto"/>
-        <w:rPr>
-          <w:rFonts w:ascii="Times New Roman" w:cs="Times New Roman" w:eastAsia="Times New Roman" w:hAnsi="Times New Roman"/>
-        </w:rPr>
-      </w:pPr>
-      <w:r>
-        <w:rPr>
-          <w:rtl w:val="0"/>
-        </w:rPr>
-      </w:r>
-    </w:p>
-    <w:p>
-      <w:pPr>
-        <w:spacing w:line="276" w:lineRule="auto"/>
-        <w:rPr>
-          <w:rFonts w:ascii="Times New Roman" w:cs="Times New Roman" w:eastAsia="Times New Roman" w:hAnsi="Times New Roman"/>
-        </w:rPr>
-      </w:pPr>
-      <w:r>
-        <w:rPr>
-          <w:rFonts w:ascii="Times New Roman" w:cs="Times New Roman" w:eastAsia="Times New Roman" w:hAnsi="Times New Roman"/>
-          <w:rtl w:val="0"/>
-        </w:rPr>
-        <w:t xml:space="preserve">Team Leader/Representative: _______________</w:t>
-      </w:r>
-    </w:p>
-    <w:p>
-      <w:pPr>
-        <w:spacing w:line="276" w:lineRule="auto"/>
-        <w:rPr>
-          <w:rFonts w:ascii="Times New Roman" w:cs="Times New Roman" w:eastAsia="Times New Roman" w:hAnsi="Times New Roman"/>
+          <w:rFonts w:ascii="Times New Roman" w:hAnsi="Times New Roman" w:eastAsia="Times New Roman" w:cs="Times New Roman"/>
+          <w:b/>
+        </w:rPr>
+      </w:pPr>
+      <w:r>
+        <w:rPr>
+          <w:rFonts w:ascii="Times New Roman" w:hAnsi="Times New Roman" w:eastAsia="Times New Roman" w:cs="Times New Roman"/>
+          <w:b/>
+          <w:bCs/>
+          <w:sz w:val="24"/>
+          <w:szCs w:val="24"/>
+        </w:rPr>
+        <w:t>AAI-500 – Team Project Status Update Form</w:t>
+      </w:r>
+      <w:r>
+        <w:rPr>
+          <w:rtl w:val="0"/>
+        </w:rPr>
+      </w:r>
+    </w:p>
+    <w:p>
+      <w:pPr>
+        <w:rPr>
+          <w:rFonts w:ascii="Times New Roman" w:hAnsi="Times New Roman" w:eastAsia="Times New Roman" w:cs="Times New Roman"/>
+        </w:rPr>
+      </w:pPr>
+      <w:r>
+        <w:rPr>
+          <w:rtl w:val="0"/>
+        </w:rPr>
+      </w:r>
+    </w:p>
+    <w:p>
+      <w:pPr>
+        <w:spacing w:line="276" w:lineRule="auto"/>
+        <w:rPr>
+          <w:rFonts w:ascii="Times New Roman" w:hAnsi="Times New Roman" w:eastAsia="Times New Roman" w:cs="Times New Roman"/>
+        </w:rPr>
+      </w:pPr>
+      <w:r>
+        <w:rPr>
+          <w:rFonts w:ascii="Times New Roman" w:hAnsi="Times New Roman" w:eastAsia="Times New Roman" w:cs="Times New Roman"/>
+          <w:sz w:val="24"/>
+          <w:szCs w:val="24"/>
+        </w:rPr>
+        <w:t>Fill out this form and submit it by the end of Module 4 in Blackboard.</w:t>
+      </w:r>
+    </w:p>
+    <w:p>
+      <w:pPr>
+        <w:spacing w:line="276" w:lineRule="auto"/>
+        <w:rPr>
+          <w:rFonts w:ascii="Times New Roman" w:hAnsi="Times New Roman" w:eastAsia="Times New Roman" w:cs="Times New Roman"/>
+        </w:rPr>
+      </w:pPr>
+      <w:r>
+        <w:rPr>
+          <w:rtl w:val="0"/>
+        </w:rPr>
+      </w:r>
+    </w:p>
+    <w:p>
+      <w:pPr>
+        <w:spacing w:line="276" w:lineRule="auto"/>
+        <w:rPr>
+          <w:rFonts w:ascii="Times New Roman" w:hAnsi="Times New Roman" w:eastAsia="Times New Roman" w:cs="Times New Roman"/>
+        </w:rPr>
+      </w:pPr>
+      <w:r>
+        <w:rPr>
+          <w:rFonts w:ascii="Times New Roman" w:hAnsi="Times New Roman" w:eastAsia="Times New Roman" w:cs="Times New Roman"/>
+          <w:sz w:val="24"/>
+          <w:szCs w:val="24"/>
+        </w:rPr>
+        <w:t>Team Number: 1</w:t>
+      </w:r>
+    </w:p>
+    <w:p>
+      <w:pPr>
+        <w:spacing w:line="276" w:lineRule="auto"/>
+        <w:rPr>
+          <w:rFonts w:ascii="Times New Roman" w:hAnsi="Times New Roman" w:eastAsia="Times New Roman" w:cs="Times New Roman"/>
+        </w:rPr>
+      </w:pPr>
+      <w:r>
+        <w:rPr>
+          <w:rtl w:val="0"/>
+        </w:rPr>
+      </w:r>
+    </w:p>
+    <w:p>
+      <w:pPr>
+        <w:spacing w:line="276" w:lineRule="auto"/>
+        <w:rPr>
+          <w:rFonts w:ascii="Times New Roman" w:hAnsi="Times New Roman" w:eastAsia="Times New Roman" w:cs="Times New Roman"/>
+        </w:rPr>
+      </w:pPr>
+      <w:r>
+        <w:rPr>
+          <w:rFonts w:ascii="Times New Roman" w:hAnsi="Times New Roman" w:eastAsia="Times New Roman" w:cs="Times New Roman"/>
+          <w:sz w:val="24"/>
+          <w:szCs w:val="24"/>
+        </w:rPr>
+        <w:t>Team Leader/Representative: Justin Nguyen</w:t>
+      </w:r>
+    </w:p>
+    <w:p>
+      <w:pPr>
+        <w:spacing w:line="276" w:lineRule="auto"/>
+        <w:rPr>
+          <w:rFonts w:ascii="Times New Roman" w:hAnsi="Times New Roman" w:eastAsia="Times New Roman" w:cs="Times New Roman"/>
         </w:rPr>
       </w:pPr>
       <w:r>
@@ -124,13 +129,14 @@
       <w:pPr>
         <w:spacing w:after="240" w:line="276" w:lineRule="auto"/>
         <w:rPr>
-          <w:rFonts w:ascii="Times New Roman" w:cs="Times New Roman" w:eastAsia="Times New Roman" w:hAnsi="Times New Roman"/>
-        </w:rPr>
-      </w:pPr>
-      <w:r>
-        <w:rPr>
-          <w:rFonts w:ascii="Times New Roman" w:cs="Times New Roman" w:eastAsia="Times New Roman" w:hAnsi="Times New Roman"/>
-          <w:rtl w:val="0"/>
+          <w:rFonts w:ascii="Times New Roman" w:hAnsi="Times New Roman" w:eastAsia="Times New Roman" w:cs="Times New Roman"/>
+        </w:rPr>
+      </w:pPr>
+      <w:r>
+        <w:rPr>
+          <w:rFonts w:ascii="Times New Roman" w:hAnsi="Times New Roman" w:eastAsia="Times New Roman" w:cs="Times New Roman"/>
+          <w:sz w:val="24"/>
+          <w:szCs w:val="24"/>
         </w:rPr>
         <w:t xml:space="preserve">Full Names of Team Members: </w:t>
       </w:r>
@@ -140,15 +146,16 @@
         <w:spacing w:line="276" w:lineRule="auto"/>
         <w:ind w:firstLine="720"/>
         <w:rPr>
-          <w:rFonts w:ascii="Times New Roman" w:cs="Times New Roman" w:eastAsia="Times New Roman" w:hAnsi="Times New Roman"/>
-        </w:rPr>
-      </w:pPr>
-      <w:r>
-        <w:rPr>
-          <w:rFonts w:ascii="Times New Roman" w:cs="Times New Roman" w:eastAsia="Times New Roman" w:hAnsi="Times New Roman"/>
-          <w:rtl w:val="0"/>
-        </w:rPr>
-        <w:t xml:space="preserve">1. ________________________________________________</w:t>
+          <w:rFonts w:ascii="Times New Roman" w:hAnsi="Times New Roman" w:eastAsia="Times New Roman" w:cs="Times New Roman"/>
+        </w:rPr>
+      </w:pPr>
+      <w:r>
+        <w:rPr>
+          <w:rFonts w:ascii="Times New Roman" w:hAnsi="Times New Roman" w:eastAsia="Times New Roman" w:cs="Times New Roman"/>
+          <w:sz w:val="24"/>
+          <w:szCs w:val="24"/>
+        </w:rPr>
+        <w:t>1. Justin Nguyen</w:t>
       </w:r>
     </w:p>
     <w:p>
@@ -156,38 +163,23 @@
         <w:spacing w:line="276" w:lineRule="auto"/>
         <w:ind w:firstLine="720"/>
         <w:rPr>
-          <w:rFonts w:ascii="Times New Roman" w:cs="Times New Roman" w:eastAsia="Times New Roman" w:hAnsi="Times New Roman"/>
-        </w:rPr>
-      </w:pPr>
-      <w:r>
-        <w:rPr>
-          <w:rFonts w:ascii="Times New Roman" w:cs="Times New Roman" w:eastAsia="Times New Roman" w:hAnsi="Times New Roman"/>
-          <w:rtl w:val="0"/>
-        </w:rPr>
-        <w:t xml:space="preserve">2. ________________________________________________</w:t>
-      </w:r>
-    </w:p>
-    <w:p>
-      <w:pPr>
-        <w:spacing w:line="276" w:lineRule="auto"/>
-        <w:ind w:firstLine="720"/>
-        <w:rPr>
-          <w:rFonts w:ascii="Times New Roman" w:cs="Times New Roman" w:eastAsia="Times New Roman" w:hAnsi="Times New Roman"/>
-        </w:rPr>
-      </w:pPr>
-      <w:r>
-        <w:rPr>
-          <w:rFonts w:ascii="Times New Roman" w:cs="Times New Roman" w:eastAsia="Times New Roman" w:hAnsi="Times New Roman"/>
-          <w:rtl w:val="0"/>
-        </w:rPr>
-        <w:t xml:space="preserve">3. ________________________________________________</w:t>
-      </w:r>
-    </w:p>
-    <w:p>
-      <w:pPr>
-        <w:spacing w:line="276" w:lineRule="auto"/>
-        <w:rPr>
-          <w:rFonts w:ascii="Times New Roman" w:cs="Times New Roman" w:eastAsia="Times New Roman" w:hAnsi="Times New Roman"/>
+          <w:rFonts w:ascii="Times New Roman" w:hAnsi="Times New Roman" w:eastAsia="Times New Roman" w:cs="Times New Roman"/>
+        </w:rPr>
+      </w:pPr>
+      <w:r>
+        <w:rPr>
+          <w:rFonts w:ascii="Times New Roman" w:hAnsi="Times New Roman" w:eastAsia="Times New Roman" w:cs="Times New Roman"/>
+          <w:sz w:val="24"/>
+          <w:szCs w:val="24"/>
+        </w:rPr>
+        <w:t>2. Kyle Abaya</w:t>
+      </w:r>
+    </w:p>
+    <w:p>
+      <w:pPr>
+        <w:spacing w:line="276" w:lineRule="auto"/>
+        <w:rPr>
+          <w:rFonts w:ascii="Times New Roman" w:hAnsi="Times New Roman" w:eastAsia="Times New Roman" w:cs="Times New Roman"/>
         </w:rPr>
       </w:pPr>
       <w:r>
@@ -206,22 +198,23 @@
         </w:tabs>
         <w:spacing w:line="276" w:lineRule="auto"/>
         <w:rPr>
-          <w:rFonts w:ascii="Times New Roman" w:cs="Times New Roman" w:eastAsia="Times New Roman" w:hAnsi="Times New Roman"/>
-        </w:rPr>
-      </w:pPr>
-      <w:r>
-        <w:rPr>
-          <w:rFonts w:ascii="Times New Roman" w:cs="Times New Roman" w:eastAsia="Times New Roman" w:hAnsi="Times New Roman"/>
-          <w:rtl w:val="0"/>
-        </w:rPr>
-        <w:t xml:space="preserve">Title of Your Project:  ______________________________________</w:t>
-      </w:r>
-    </w:p>
-    <w:p>
-      <w:pPr>
-        <w:spacing w:line="276" w:lineRule="auto"/>
-        <w:rPr>
-          <w:rFonts w:ascii="Times New Roman" w:cs="Times New Roman" w:eastAsia="Times New Roman" w:hAnsi="Times New Roman"/>
+          <w:rFonts w:ascii="Times New Roman" w:hAnsi="Times New Roman" w:eastAsia="Times New Roman" w:cs="Times New Roman"/>
+        </w:rPr>
+      </w:pPr>
+      <w:r>
+        <w:rPr>
+          <w:rFonts w:ascii="Times New Roman" w:hAnsi="Times New Roman" w:eastAsia="Times New Roman" w:cs="Times New Roman"/>
+          <w:sz w:val="24"/>
+          <w:szCs w:val="24"/>
+        </w:rPr>
+        <w:t xml:space="preserve">Title of Your Project:  Predictive Maintenance</w:t>
+      </w:r>
+    </w:p>
+    <w:p>
+      <w:pPr>
+        <w:spacing w:line="276" w:lineRule="auto"/>
+        <w:rPr>
+          <w:rFonts w:ascii="Times New Roman" w:hAnsi="Times New Roman" w:eastAsia="Times New Roman" w:cs="Times New Roman"/>
         </w:rPr>
       </w:pPr>
       <w:r>
@@ -237,106 +230,23 @@
         </w:tabs>
         <w:spacing w:line="276" w:lineRule="auto"/>
         <w:rPr>
-          <w:rFonts w:ascii="Times New Roman" w:cs="Times New Roman" w:eastAsia="Times New Roman" w:hAnsi="Times New Roman"/>
-        </w:rPr>
-      </w:pPr>
-      <w:r>
-        <w:rPr>
-          <w:rFonts w:ascii="Times New Roman" w:cs="Times New Roman" w:eastAsia="Times New Roman" w:hAnsi="Times New Roman"/>
-          <w:rtl w:val="0"/>
-        </w:rPr>
-        <w:t xml:space="preserve">Short Description of Your Project and Objectives: ______________________________________</w:t>
-      </w:r>
-    </w:p>
-    <w:p>
-      <w:pPr>
-        <w:spacing w:line="276" w:lineRule="auto"/>
-        <w:rPr>
-          <w:rFonts w:ascii="Times New Roman" w:cs="Times New Roman" w:eastAsia="Times New Roman" w:hAnsi="Times New Roman"/>
-        </w:rPr>
-      </w:pPr>
-      <w:r>
-        <w:rPr>
-          <w:rtl w:val="0"/>
-        </w:rPr>
-      </w:r>
-    </w:p>
-    <w:p>
-      <w:pPr>
-        <w:spacing w:line="276" w:lineRule="auto"/>
-        <w:rPr>
-          <w:rFonts w:ascii="Times New Roman" w:cs="Times New Roman" w:eastAsia="Times New Roman" w:hAnsi="Times New Roman"/>
-        </w:rPr>
-      </w:pPr>
-      <w:r>
-        <w:rPr>
-          <w:rFonts w:ascii="Times New Roman" w:cs="Times New Roman" w:eastAsia="Times New Roman" w:hAnsi="Times New Roman"/>
-          <w:rtl w:val="0"/>
-        </w:rPr>
-        <w:t xml:space="preserve">_______________________________________________________________________________</w:t>
-      </w:r>
-    </w:p>
-    <w:p>
-      <w:pPr>
-        <w:spacing w:line="276" w:lineRule="auto"/>
-        <w:rPr>
-          <w:rFonts w:ascii="Times New Roman" w:cs="Times New Roman" w:eastAsia="Times New Roman" w:hAnsi="Times New Roman"/>
-        </w:rPr>
-      </w:pPr>
-      <w:r>
-        <w:rPr>
-          <w:rtl w:val="0"/>
-        </w:rPr>
-      </w:r>
-    </w:p>
-    <w:p>
-      <w:pPr>
-        <w:spacing w:line="276" w:lineRule="auto"/>
-        <w:rPr>
-          <w:rFonts w:ascii="Times New Roman" w:cs="Times New Roman" w:eastAsia="Times New Roman" w:hAnsi="Times New Roman"/>
-        </w:rPr>
-      </w:pPr>
-      <w:r>
-        <w:rPr>
-          <w:rFonts w:ascii="Times New Roman" w:cs="Times New Roman" w:eastAsia="Times New Roman" w:hAnsi="Times New Roman"/>
-          <w:rtl w:val="0"/>
-        </w:rPr>
-        <w:t xml:space="preserve">_______________________________________________________________________________</w:t>
-      </w:r>
-    </w:p>
-    <w:p>
-      <w:pPr>
-        <w:spacing w:line="276" w:lineRule="auto"/>
-        <w:rPr>
-          <w:rFonts w:ascii="Times New Roman" w:cs="Times New Roman" w:eastAsia="Times New Roman" w:hAnsi="Times New Roman"/>
-        </w:rPr>
-      </w:pPr>
-      <w:r>
-        <w:rPr>
-          <w:rtl w:val="0"/>
-        </w:rPr>
-      </w:r>
-    </w:p>
-    <w:p>
-      <w:pPr>
-        <w:spacing w:line="276" w:lineRule="auto"/>
-        <w:rPr>
-          <w:rFonts w:ascii="Times New Roman" w:cs="Times New Roman" w:eastAsia="Times New Roman" w:hAnsi="Times New Roman"/>
-        </w:rPr>
-      </w:pPr>
-      <w:r>
-        <w:rPr>
-          <w:rFonts w:ascii="Times New Roman" w:cs="Times New Roman" w:eastAsia="Times New Roman" w:hAnsi="Times New Roman"/>
-          <w:rtl w:val="0"/>
-        </w:rPr>
-        <w:t xml:space="preserve">_______________________________________________________________________________</w:t>
-      </w:r>
-    </w:p>
-    <w:p>
-      <w:pPr>
-        <w:spacing w:line="276" w:lineRule="auto"/>
-        <w:rPr>
-          <w:rFonts w:ascii="Times New Roman" w:cs="Times New Roman" w:eastAsia="Times New Roman" w:hAnsi="Times New Roman"/>
+          <w:rFonts w:ascii="Times New Roman" w:hAnsi="Times New Roman" w:eastAsia="Times New Roman" w:cs="Times New Roman"/>
+        </w:rPr>
+      </w:pPr>
+      <w:r>
+        <w:rPr>
+          <w:rFonts w:ascii="Times New Roman" w:hAnsi="Times New Roman" w:eastAsia="Times New Roman" w:cs="Times New Roman"/>
+          <w:sz w:val="24"/>
+          <w:szCs w:val="24"/>
+        </w:rPr>
+        <w:t>Short Description of Your Project and Objectives: The objective of this project is to predict equipment failure before it happens so that maintenance can be done proactively.</w:t>
+      </w:r>
+    </w:p>
+    <w:p>
+      <w:pPr>
+        <w:spacing w:line="276" w:lineRule="auto"/>
+        <w:rPr>
+          <w:rFonts w:ascii="Times New Roman" w:hAnsi="Times New Roman" w:eastAsia="Times New Roman" w:cs="Times New Roman"/>
         </w:rPr>
       </w:pPr>
       <w:r>
@@ -352,22 +262,23 @@
         </w:tabs>
         <w:spacing w:line="276" w:lineRule="auto"/>
         <w:rPr>
-          <w:rFonts w:ascii="Times New Roman" w:cs="Times New Roman" w:eastAsia="Times New Roman" w:hAnsi="Times New Roman"/>
-        </w:rPr>
-      </w:pPr>
-      <w:r>
-        <w:rPr>
-          <w:rFonts w:ascii="Times New Roman" w:cs="Times New Roman" w:eastAsia="Times New Roman" w:hAnsi="Times New Roman"/>
-          <w:rtl w:val="0"/>
-        </w:rPr>
-        <w:t xml:space="preserve">Name of Your Selected Dataset: ______________________________</w:t>
-      </w:r>
-    </w:p>
-    <w:p>
-      <w:pPr>
-        <w:spacing w:line="276" w:lineRule="auto"/>
-        <w:rPr>
-          <w:rFonts w:ascii="Times New Roman" w:cs="Times New Roman" w:eastAsia="Times New Roman" w:hAnsi="Times New Roman"/>
+          <w:rFonts w:ascii="Times New Roman" w:hAnsi="Times New Roman" w:eastAsia="Times New Roman" w:cs="Times New Roman"/>
+        </w:rPr>
+      </w:pPr>
+      <w:r>
+        <w:rPr>
+          <w:rFonts w:ascii="Times New Roman" w:hAnsi="Times New Roman" w:eastAsia="Times New Roman" w:cs="Times New Roman"/>
+          <w:sz w:val="24"/>
+          <w:szCs w:val="24"/>
+        </w:rPr>
+        <w:t>Name of Your Selected Dataset: AI41 2020 Predictive Maintenance Dataset</w:t>
+      </w:r>
+    </w:p>
+    <w:p>
+      <w:pPr>
+        <w:spacing w:line="276" w:lineRule="auto"/>
+        <w:rPr>
+          <w:rFonts w:ascii="Times New Roman" w:hAnsi="Times New Roman" w:eastAsia="Times New Roman" w:cs="Times New Roman"/>
         </w:rPr>
       </w:pPr>
       <w:r>
@@ -383,13 +294,14 @@
         </w:tabs>
         <w:spacing w:line="276" w:lineRule="auto"/>
         <w:rPr>
-          <w:rFonts w:ascii="Times New Roman" w:cs="Times New Roman" w:eastAsia="Times New Roman" w:hAnsi="Times New Roman"/>
-        </w:rPr>
-      </w:pPr>
-      <w:r>
-        <w:rPr>
-          <w:rFonts w:ascii="Times New Roman" w:cs="Times New Roman" w:eastAsia="Times New Roman" w:hAnsi="Times New Roman"/>
-          <w:rtl w:val="0"/>
+          <w:rFonts w:ascii="Times New Roman" w:hAnsi="Times New Roman" w:eastAsia="Times New Roman" w:cs="Times New Roman"/>
+        </w:rPr>
+      </w:pPr>
+      <w:r>
+        <w:rPr>
+          <w:rFonts w:ascii="Times New Roman" w:hAnsi="Times New Roman" w:eastAsia="Times New Roman" w:cs="Times New Roman"/>
+          <w:sz w:val="24"/>
+          <w:szCs w:val="24"/>
         </w:rPr>
         <w:t xml:space="preserve">Description of Your Selected Dataset (data source, number of variables, size of dataset, etc.): </w:t>
       </w:r>
@@ -398,91 +310,94 @@
       <w:pPr>
         <w:spacing w:line="276" w:lineRule="auto"/>
         <w:rPr>
-          <w:rFonts w:ascii="Times New Roman" w:cs="Times New Roman" w:eastAsia="Times New Roman" w:hAnsi="Times New Roman"/>
-        </w:rPr>
-      </w:pPr>
-      <w:r>
-        <w:rPr>
-          <w:rtl w:val="0"/>
-        </w:rPr>
-      </w:r>
-    </w:p>
-    <w:p>
-      <w:pPr>
-        <w:spacing w:line="276" w:lineRule="auto"/>
-        <w:rPr>
-          <w:rFonts w:ascii="Times New Roman" w:cs="Times New Roman" w:eastAsia="Times New Roman" w:hAnsi="Times New Roman"/>
-        </w:rPr>
-      </w:pPr>
-      <w:r>
-        <w:rPr>
-          <w:rFonts w:ascii="Times New Roman" w:cs="Times New Roman" w:eastAsia="Times New Roman" w:hAnsi="Times New Roman"/>
-          <w:rtl w:val="0"/>
-        </w:rPr>
-        <w:t xml:space="preserve">___________________________________________________________________________</w:t>
-      </w:r>
-    </w:p>
-    <w:p>
-      <w:pPr>
-        <w:spacing w:line="276" w:lineRule="auto"/>
-        <w:rPr>
-          <w:rFonts w:ascii="Times New Roman" w:cs="Times New Roman" w:eastAsia="Times New Roman" w:hAnsi="Times New Roman"/>
-        </w:rPr>
-      </w:pPr>
-      <w:r>
-        <w:rPr>
-          <w:rtl w:val="0"/>
-        </w:rPr>
-      </w:r>
-    </w:p>
-    <w:p>
-      <w:pPr>
-        <w:spacing w:line="276" w:lineRule="auto"/>
-        <w:rPr>
-          <w:rFonts w:ascii="Times New Roman" w:cs="Times New Roman" w:eastAsia="Times New Roman" w:hAnsi="Times New Roman"/>
-        </w:rPr>
-      </w:pPr>
-      <w:r>
-        <w:rPr>
-          <w:rFonts w:ascii="Times New Roman" w:cs="Times New Roman" w:eastAsia="Times New Roman" w:hAnsi="Times New Roman"/>
-          <w:rtl w:val="0"/>
-        </w:rPr>
-        <w:t xml:space="preserve">___________________________________________________________________________</w:t>
-      </w:r>
-    </w:p>
-    <w:p>
-      <w:pPr>
-        <w:spacing w:line="276" w:lineRule="auto"/>
-        <w:rPr>
-          <w:rFonts w:ascii="Times New Roman" w:cs="Times New Roman" w:eastAsia="Times New Roman" w:hAnsi="Times New Roman"/>
-        </w:rPr>
-      </w:pPr>
-      <w:r>
-        <w:rPr>
-          <w:rtl w:val="0"/>
-        </w:rPr>
-      </w:r>
-    </w:p>
-    <w:p>
-      <w:pPr>
-        <w:spacing w:line="276" w:lineRule="auto"/>
-        <w:rPr>
-          <w:rFonts w:ascii="Times New Roman" w:cs="Times New Roman" w:eastAsia="Times New Roman" w:hAnsi="Times New Roman"/>
-        </w:rPr>
-      </w:pPr>
-      <w:r>
-        <w:rPr>
-          <w:rFonts w:ascii="Times New Roman" w:cs="Times New Roman" w:eastAsia="Times New Roman" w:hAnsi="Times New Roman"/>
-          <w:rtl w:val="0"/>
-        </w:rPr>
-        <w:t xml:space="preserve">___________________________________________________________________________</w:t>
-      </w:r>
-    </w:p>
-    <w:p>
-      <w:pPr>
-        <w:spacing w:line="276" w:lineRule="auto"/>
-        <w:rPr>
-          <w:rFonts w:ascii="Times New Roman" w:cs="Times New Roman" w:eastAsia="Times New Roman" w:hAnsi="Times New Roman"/>
+          <w:rFonts w:ascii="Times New Roman" w:hAnsi="Times New Roman" w:eastAsia="Times New Roman" w:cs="Times New Roman"/>
+        </w:rPr>
+      </w:pPr>
+      <w:r>
+        <w:rPr>
+          <w:rtl w:val="0"/>
+        </w:rPr>
+      </w:r>
+    </w:p>
+    <w:p>
+      <w:pPr>
+        <w:spacing w:line="276" w:lineRule="auto"/>
+        <w:rPr>
+          <w:rFonts w:ascii="Times New Roman" w:hAnsi="Times New Roman" w:eastAsia="Times New Roman" w:cs="Times New Roman"/>
+        </w:rPr>
+      </w:pPr>
+      <w:r>
+        <w:rPr>
+          <w:rFonts w:ascii="Times New Roman" w:hAnsi="Times New Roman" w:eastAsia="Times New Roman" w:cs="Times New Roman"/>
+          <w:sz w:val="24"/>
+          <w:szCs w:val="24"/>
+        </w:rPr>
+        <w:t>___________________________________________________________________________</w:t>
+      </w:r>
+    </w:p>
+    <w:p>
+      <w:pPr>
+        <w:spacing w:line="276" w:lineRule="auto"/>
+        <w:rPr>
+          <w:rFonts w:ascii="Times New Roman" w:hAnsi="Times New Roman" w:eastAsia="Times New Roman" w:cs="Times New Roman"/>
+        </w:rPr>
+      </w:pPr>
+      <w:r>
+        <w:rPr>
+          <w:rtl w:val="0"/>
+        </w:rPr>
+      </w:r>
+    </w:p>
+    <w:p>
+      <w:pPr>
+        <w:spacing w:line="276" w:lineRule="auto"/>
+        <w:rPr>
+          <w:rFonts w:ascii="Times New Roman" w:hAnsi="Times New Roman" w:eastAsia="Times New Roman" w:cs="Times New Roman"/>
+        </w:rPr>
+      </w:pPr>
+      <w:r>
+        <w:rPr>
+          <w:rFonts w:ascii="Times New Roman" w:hAnsi="Times New Roman" w:eastAsia="Times New Roman" w:cs="Times New Roman"/>
+          <w:sz w:val="24"/>
+          <w:szCs w:val="24"/>
+        </w:rPr>
+        <w:t>___________________________________________________________________________</w:t>
+      </w:r>
+    </w:p>
+    <w:p>
+      <w:pPr>
+        <w:spacing w:line="276" w:lineRule="auto"/>
+        <w:rPr>
+          <w:rFonts w:ascii="Times New Roman" w:hAnsi="Times New Roman" w:eastAsia="Times New Roman" w:cs="Times New Roman"/>
+        </w:rPr>
+      </w:pPr>
+      <w:r>
+        <w:rPr>
+          <w:rtl w:val="0"/>
+        </w:rPr>
+      </w:r>
+    </w:p>
+    <w:p>
+      <w:pPr>
+        <w:spacing w:line="276" w:lineRule="auto"/>
+        <w:rPr>
+          <w:rFonts w:ascii="Times New Roman" w:hAnsi="Times New Roman" w:eastAsia="Times New Roman" w:cs="Times New Roman"/>
+        </w:rPr>
+      </w:pPr>
+      <w:r>
+        <w:rPr>
+          <w:rFonts w:ascii="Times New Roman" w:hAnsi="Times New Roman" w:eastAsia="Times New Roman" w:cs="Times New Roman"/>
+          <w:sz w:val="24"/>
+          <w:szCs w:val="24"/>
+        </w:rPr>
+        <w:t>___________________________________________________________________________</w:t>
+      </w:r>
+    </w:p>
+    <w:p>
+      <w:pPr>
+        <w:spacing w:line="276" w:lineRule="auto"/>
+        <w:rPr>
+          <w:rFonts w:ascii="Times New Roman" w:hAnsi="Times New Roman" w:eastAsia="Times New Roman" w:cs="Times New Roman"/>
         </w:rPr>
       </w:pPr>
       <w:r>
@@ -499,50 +414,52 @@
         </w:tabs>
         <w:spacing w:line="276" w:lineRule="auto"/>
         <w:rPr>
-          <w:rFonts w:ascii="Times New Roman" w:cs="Times New Roman" w:eastAsia="Times New Roman" w:hAnsi="Times New Roman"/>
-        </w:rPr>
-      </w:pPr>
-      <w:r>
-        <w:rPr>
-          <w:rFonts w:ascii="Times New Roman" w:cs="Times New Roman" w:eastAsia="Times New Roman" w:hAnsi="Times New Roman"/>
-          <w:rtl w:val="0"/>
-        </w:rPr>
-        <w:t xml:space="preserve">Are you using and practicing GitHub as a code hosting platform for version control and collaboration? If yes, provide the link here: _______________________</w:t>
-      </w:r>
-    </w:p>
-    <w:p>
-      <w:pPr>
-        <w:spacing w:line="276" w:lineRule="auto"/>
-        <w:rPr>
-          <w:rFonts w:ascii="Times New Roman" w:cs="Times New Roman" w:eastAsia="Times New Roman" w:hAnsi="Times New Roman"/>
-        </w:rPr>
-      </w:pPr>
-      <w:r>
-        <w:rPr>
-          <w:rtl w:val="0"/>
-        </w:rPr>
-      </w:r>
-    </w:p>
-    <w:p>
-      <w:pPr>
-        <w:spacing w:line="276" w:lineRule="auto"/>
-        <w:rPr>
-          <w:rFonts w:ascii="Times New Roman" w:cs="Times New Roman" w:eastAsia="Times New Roman" w:hAnsi="Times New Roman"/>
-        </w:rPr>
-      </w:pPr>
-      <w:r>
-        <w:rPr>
-          <w:rFonts w:ascii="Times New Roman" w:cs="Times New Roman" w:eastAsia="Times New Roman" w:hAnsi="Times New Roman"/>
-          <w:rtl w:val="0"/>
-        </w:rPr>
-        <w:t xml:space="preserve">How many times have your members met in the last two weeks? _______________________</w:t>
-      </w:r>
-    </w:p>
-    <w:p>
-      <w:pPr>
-        <w:spacing w:line="276" w:lineRule="auto"/>
-        <w:rPr>
-          <w:rFonts w:ascii="Times New Roman" w:cs="Times New Roman" w:eastAsia="Times New Roman" w:hAnsi="Times New Roman"/>
+          <w:rFonts w:ascii="Times New Roman" w:hAnsi="Times New Roman" w:eastAsia="Times New Roman" w:cs="Times New Roman"/>
+        </w:rPr>
+      </w:pPr>
+      <w:r>
+        <w:rPr>
+          <w:rFonts w:ascii="Times New Roman" w:hAnsi="Times New Roman" w:eastAsia="Times New Roman" w:cs="Times New Roman"/>
+          <w:sz w:val="24"/>
+          <w:szCs w:val="24"/>
+        </w:rPr>
+        <w:t>Are you using and practicing GitHub as a code hosting platform for version control and collaboration? If yes, provide the link here: _______________________</w:t>
+      </w:r>
+    </w:p>
+    <w:p>
+      <w:pPr>
+        <w:spacing w:line="276" w:lineRule="auto"/>
+        <w:rPr>
+          <w:rFonts w:ascii="Times New Roman" w:hAnsi="Times New Roman" w:eastAsia="Times New Roman" w:cs="Times New Roman"/>
+        </w:rPr>
+      </w:pPr>
+      <w:r>
+        <w:rPr>
+          <w:rtl w:val="0"/>
+        </w:rPr>
+      </w:r>
+    </w:p>
+    <w:p>
+      <w:pPr>
+        <w:spacing w:line="276" w:lineRule="auto"/>
+        <w:rPr>
+          <w:rFonts w:ascii="Times New Roman" w:hAnsi="Times New Roman" w:eastAsia="Times New Roman" w:cs="Times New Roman"/>
+        </w:rPr>
+      </w:pPr>
+      <w:r>
+        <w:rPr>
+          <w:rFonts w:ascii="Times New Roman" w:hAnsi="Times New Roman" w:eastAsia="Times New Roman" w:cs="Times New Roman"/>
+          <w:sz w:val="24"/>
+          <w:szCs w:val="24"/>
+        </w:rPr>
+        <w:t>How many times have your members met in the last two weeks? _______________________</w:t>
+      </w:r>
+    </w:p>
+    <w:p>
+      <w:pPr>
+        <w:spacing w:line="276" w:lineRule="auto"/>
+        <w:rPr>
+          <w:rFonts w:ascii="Times New Roman" w:hAnsi="Times New Roman" w:eastAsia="Times New Roman" w:cs="Times New Roman"/>
         </w:rPr>
       </w:pPr>
       <w:r>
@@ -559,173 +476,180 @@
         </w:tabs>
         <w:spacing w:line="276" w:lineRule="auto"/>
         <w:rPr>
-          <w:rFonts w:ascii="Times New Roman" w:cs="Times New Roman" w:eastAsia="Times New Roman" w:hAnsi="Times New Roman"/>
-        </w:rPr>
-      </w:pPr>
-      <w:r>
-        <w:rPr>
-          <w:rFonts w:ascii="Times New Roman" w:cs="Times New Roman" w:eastAsia="Times New Roman" w:hAnsi="Times New Roman"/>
-          <w:rtl w:val="0"/>
+          <w:rFonts w:ascii="Times New Roman" w:hAnsi="Times New Roman" w:eastAsia="Times New Roman" w:cs="Times New Roman"/>
+        </w:rPr>
+      </w:pPr>
+      <w:r>
+        <w:rPr>
+          <w:rFonts w:ascii="Times New Roman" w:hAnsi="Times New Roman" w:eastAsia="Times New Roman" w:cs="Times New Roman"/>
+          <w:sz w:val="24"/>
+          <w:szCs w:val="24"/>
         </w:rPr>
         <w:t xml:space="preserve">What was the agreed upon method of communication? Are you using any teamwork project management software, such as </w:t>
       </w:r>
       <w:hyperlink r:id="rId7">
         <w:r>
           <w:rPr>
-            <w:rFonts w:ascii="Times New Roman" w:cs="Times New Roman" w:eastAsia="Times New Roman" w:hAnsi="Times New Roman"/>
+            <w:rFonts w:ascii="Times New Roman" w:hAnsi="Times New Roman" w:eastAsia="Times New Roman" w:cs="Times New Roman"/>
             <w:color w:val="0000ff"/>
+            <w:sz w:val="24"/>
+            <w:szCs w:val="24"/>
             <w:u w:val="single"/>
-            <w:rtl w:val="0"/>
           </w:rPr>
-          <w:t xml:space="preserve">Trello</w:t>
+          <w:t>Trello</w:t>
         </w:r>
       </w:hyperlink>
       <w:r>
         <w:rPr>
-          <w:rFonts w:ascii="Times New Roman" w:cs="Times New Roman" w:eastAsia="Times New Roman" w:hAnsi="Times New Roman"/>
-          <w:rtl w:val="0"/>
+          <w:rFonts w:ascii="Times New Roman" w:hAnsi="Times New Roman" w:eastAsia="Times New Roman" w:cs="Times New Roman"/>
+          <w:sz w:val="24"/>
+          <w:szCs w:val="24"/>
         </w:rPr>
         <w:t xml:space="preserve"> or </w:t>
       </w:r>
       <w:hyperlink r:id="rId8">
         <w:r>
           <w:rPr>
-            <w:rFonts w:ascii="Times New Roman" w:cs="Times New Roman" w:eastAsia="Times New Roman" w:hAnsi="Times New Roman"/>
+            <w:rFonts w:ascii="Times New Roman" w:hAnsi="Times New Roman" w:eastAsia="Times New Roman" w:cs="Times New Roman"/>
             <w:color w:val="0000ff"/>
+            <w:sz w:val="24"/>
+            <w:szCs w:val="24"/>
             <w:u w:val="single"/>
-            <w:rtl w:val="0"/>
           </w:rPr>
-          <w:t xml:space="preserve">Asana</w:t>
+          <w:t>Asana</w:t>
         </w:r>
       </w:hyperlink>
       <w:r>
         <w:rPr>
-          <w:rFonts w:ascii="Times New Roman" w:cs="Times New Roman" w:eastAsia="Times New Roman" w:hAnsi="Times New Roman"/>
-          <w:rtl w:val="0"/>
-        </w:rPr>
-        <w:t xml:space="preserve">? ___________________</w:t>
-      </w:r>
-    </w:p>
-    <w:p>
-      <w:pPr>
-        <w:spacing w:line="276" w:lineRule="auto"/>
-        <w:rPr>
-          <w:rFonts w:ascii="Times New Roman" w:cs="Times New Roman" w:eastAsia="Times New Roman" w:hAnsi="Times New Roman"/>
-        </w:rPr>
-      </w:pPr>
-      <w:r>
-        <w:rPr>
-          <w:rtl w:val="0"/>
-        </w:rPr>
-      </w:r>
-    </w:p>
-    <w:p>
-      <w:pPr>
-        <w:spacing w:line="276" w:lineRule="auto"/>
-        <w:rPr>
-          <w:rFonts w:ascii="Times New Roman" w:cs="Times New Roman" w:eastAsia="Times New Roman" w:hAnsi="Times New Roman"/>
-        </w:rPr>
-      </w:pPr>
-      <w:r>
-        <w:rPr>
-          <w:rFonts w:ascii="Times New Roman" w:cs="Times New Roman" w:eastAsia="Times New Roman" w:hAnsi="Times New Roman"/>
-          <w:rtl w:val="0"/>
-        </w:rPr>
-        <w:t xml:space="preserve">Comments/ Roadblocks: _______________________________________________________</w:t>
-      </w:r>
-    </w:p>
-    <w:p>
-      <w:pPr>
-        <w:spacing w:line="276" w:lineRule="auto"/>
-        <w:rPr>
-          <w:rFonts w:ascii="Times New Roman" w:cs="Times New Roman" w:eastAsia="Times New Roman" w:hAnsi="Times New Roman"/>
-        </w:rPr>
-      </w:pPr>
-      <w:r>
-        <w:rPr>
-          <w:rtl w:val="0"/>
-        </w:rPr>
-      </w:r>
-    </w:p>
-    <w:p>
-      <w:pPr>
-        <w:spacing w:line="276" w:lineRule="auto"/>
-        <w:rPr>
-          <w:rFonts w:ascii="Times New Roman" w:cs="Times New Roman" w:eastAsia="Times New Roman" w:hAnsi="Times New Roman"/>
-        </w:rPr>
-      </w:pPr>
-      <w:r>
-        <w:rPr>
-          <w:rFonts w:ascii="Times New Roman" w:cs="Times New Roman" w:eastAsia="Times New Roman" w:hAnsi="Times New Roman"/>
-          <w:rtl w:val="0"/>
-        </w:rPr>
-        <w:t xml:space="preserve">___________________________________________________________________________</w:t>
-      </w:r>
-    </w:p>
-    <w:p>
-      <w:pPr>
-        <w:spacing w:line="276" w:lineRule="auto"/>
-        <w:rPr>
-          <w:rFonts w:ascii="Times New Roman" w:cs="Times New Roman" w:eastAsia="Times New Roman" w:hAnsi="Times New Roman"/>
-        </w:rPr>
-      </w:pPr>
-      <w:r>
-        <w:rPr>
-          <w:rtl w:val="0"/>
-        </w:rPr>
-      </w:r>
-    </w:p>
-    <w:p>
-      <w:pPr>
-        <w:spacing w:line="276" w:lineRule="auto"/>
-        <w:rPr>
-          <w:rFonts w:ascii="Times New Roman" w:cs="Times New Roman" w:eastAsia="Times New Roman" w:hAnsi="Times New Roman"/>
-        </w:rPr>
-      </w:pPr>
-      <w:r>
-        <w:rPr>
-          <w:rFonts w:ascii="Times New Roman" w:cs="Times New Roman" w:eastAsia="Times New Roman" w:hAnsi="Times New Roman"/>
-          <w:rtl w:val="0"/>
-        </w:rPr>
-        <w:t xml:space="preserve">___________________________________________________________________________</w:t>
+          <w:rFonts w:ascii="Times New Roman" w:hAnsi="Times New Roman" w:eastAsia="Times New Roman" w:cs="Times New Roman"/>
+          <w:sz w:val="24"/>
+          <w:szCs w:val="24"/>
+        </w:rPr>
+        <w:t>? ___________________</w:t>
+      </w:r>
+    </w:p>
+    <w:p>
+      <w:pPr>
+        <w:spacing w:line="276" w:lineRule="auto"/>
+        <w:rPr>
+          <w:rFonts w:ascii="Times New Roman" w:hAnsi="Times New Roman" w:eastAsia="Times New Roman" w:cs="Times New Roman"/>
+        </w:rPr>
+      </w:pPr>
+      <w:r>
+        <w:rPr>
+          <w:rtl w:val="0"/>
+        </w:rPr>
+      </w:r>
+    </w:p>
+    <w:p>
+      <w:pPr>
+        <w:spacing w:line="276" w:lineRule="auto"/>
+        <w:rPr>
+          <w:rFonts w:ascii="Times New Roman" w:hAnsi="Times New Roman" w:eastAsia="Times New Roman" w:cs="Times New Roman"/>
+        </w:rPr>
+      </w:pPr>
+      <w:r>
+        <w:rPr>
+          <w:rFonts w:ascii="Times New Roman" w:hAnsi="Times New Roman" w:eastAsia="Times New Roman" w:cs="Times New Roman"/>
+          <w:sz w:val="24"/>
+          <w:szCs w:val="24"/>
+        </w:rPr>
+        <w:t>Comments/ Roadblocks: _______________________________________________________</w:t>
+      </w:r>
+    </w:p>
+    <w:p>
+      <w:pPr>
+        <w:spacing w:line="276" w:lineRule="auto"/>
+        <w:rPr>
+          <w:rFonts w:ascii="Times New Roman" w:hAnsi="Times New Roman" w:eastAsia="Times New Roman" w:cs="Times New Roman"/>
+        </w:rPr>
+      </w:pPr>
+      <w:r>
+        <w:rPr>
+          <w:rtl w:val="0"/>
+        </w:rPr>
+      </w:r>
+    </w:p>
+    <w:p>
+      <w:pPr>
+        <w:spacing w:line="276" w:lineRule="auto"/>
+        <w:rPr>
+          <w:rFonts w:ascii="Times New Roman" w:hAnsi="Times New Roman" w:eastAsia="Times New Roman" w:cs="Times New Roman"/>
+        </w:rPr>
+      </w:pPr>
+      <w:r>
+        <w:rPr>
+          <w:rFonts w:ascii="Times New Roman" w:hAnsi="Times New Roman" w:eastAsia="Times New Roman" w:cs="Times New Roman"/>
+          <w:sz w:val="24"/>
+          <w:szCs w:val="24"/>
+        </w:rPr>
+        <w:t>___________________________________________________________________________</w:t>
+      </w:r>
+    </w:p>
+    <w:p>
+      <w:pPr>
+        <w:spacing w:line="276" w:lineRule="auto"/>
+        <w:rPr>
+          <w:rFonts w:ascii="Times New Roman" w:hAnsi="Times New Roman" w:eastAsia="Times New Roman" w:cs="Times New Roman"/>
+        </w:rPr>
+      </w:pPr>
+      <w:r>
+        <w:rPr>
+          <w:rtl w:val="0"/>
+        </w:rPr>
+      </w:r>
+    </w:p>
+    <w:p>
+      <w:pPr>
+        <w:spacing w:line="276" w:lineRule="auto"/>
+        <w:rPr>
+          <w:rFonts w:ascii="Times New Roman" w:hAnsi="Times New Roman" w:eastAsia="Times New Roman" w:cs="Times New Roman"/>
+        </w:rPr>
+      </w:pPr>
+      <w:r>
+        <w:rPr>
+          <w:rFonts w:ascii="Times New Roman" w:hAnsi="Times New Roman" w:eastAsia="Times New Roman" w:cs="Times New Roman"/>
+          <w:sz w:val="24"/>
+          <w:szCs w:val="24"/>
+        </w:rPr>
+        <w:t>___________________________________________________________________________</w:t>
       </w:r>
     </w:p>
     <w:sectPr>
-      <w:headerReference r:id="rId9" w:type="default"/>
-      <w:footerReference r:id="rId10" w:type="default"/>
-      <w:pgSz w:h="15840" w:w="12240" w:orient="portrait"/>
-      <w:pgMar w:bottom="1440" w:top="2700" w:left="1260" w:right="1440" w:header="720" w:footer="720"/>
-      <w:pgNumType w:start="1"/>
+      <w:headerReference w:type="default" r:id="rId9"/>
+      <w:footerReference w:type="default" r:id="rId10"/>
+      <w:pgSz w:w="12240" w:h="15840"/>
+      <w:pgMar w:top="2700" w:right="1440" w:bottom="1440" w:left="1260" w:header="720" w:footer="720"/>
     </w:sectPr>
   </w:body>
 </w:document>
 </file>
 
 <file path=word/footer1.xml><?xml version="1.0" encoding="utf-8"?>
-<w:ftr xmlns:mc="http://schemas.openxmlformats.org/markup-compatibility/2006" xmlns:o="urn:schemas-microsoft-com:office:office" xmlns:r="http://schemas.openxmlformats.org/officeDocument/2006/relationships" xmlns:m="http://schemas.openxmlformats.org/officeDocument/2006/math" xmlns:v="urn:schemas-microsoft-com:vml" xmlns:wp="http://schemas.openxmlformats.org/drawingml/2006/wordprocessingDrawing" xmlns:w10="urn:schemas-microsoft-com:office:word" xmlns:w="http://schemas.openxmlformats.org/wordprocessingml/2006/main" xmlns:wne="http://schemas.microsoft.com/office/word/2006/wordml" xmlns:sl="http://schemas.openxmlformats.org/schemaLibrary/2006/main" xmlns:a="http://schemas.openxmlformats.org/drawingml/2006/main" xmlns:pic="http://schemas.openxmlformats.org/drawingml/2006/picture" xmlns:c="http://schemas.openxmlformats.org/drawingml/2006/chart" xmlns:lc="http://schemas.openxmlformats.org/drawingml/2006/lockedCanvas" xmlns:dgm="http://schemas.openxmlformats.org/drawingml/2006/diagram" xmlns:wps="http://schemas.microsoft.com/office/word/2010/wordprocessingShape" xmlns:wpg="http://schemas.microsoft.com/office/word/2010/wordprocessingGroup" xmlns:w14="http://schemas.microsoft.com/office/word/2010/wordml" xmlns:w15="http://schemas.microsoft.com/office/word/2012/wordml">
+<w:ftr xmlns:wpc="http://schemas.microsoft.com/office/word/2010/wordprocessingCanvas" xmlns:mc="http://schemas.openxmlformats.org/markup-compatibility/2006" xmlns:o="urn:schemas-microsoft-com:office:office" xmlns:r="http://schemas.openxmlformats.org/officeDocument/2006/relationships" xmlns:m="http://schemas.openxmlformats.org/officeDocument/2006/math" xmlns:v="urn:schemas-microsoft-com:vml" xmlns:wp14="http://schemas.microsoft.com/office/word/2010/wordprocessingDrawing" xmlns:wp="http://schemas.openxmlformats.org/drawingml/2006/wordprocessingDrawing" xmlns:w10="urn:schemas-microsoft-com:office:word" xmlns:w="http://schemas.openxmlformats.org/wordprocessingml/2006/main" xmlns:w14="http://schemas.microsoft.com/office/word/2010/wordml" xmlns:w15="http://schemas.microsoft.com/office/word/2012/wordml" xmlns:w16se="http://schemas.microsoft.com/office/word/2015/wordml/symex" xmlns:w16cid="http://schemas.microsoft.com/office/word/2016/wordml/cid" xmlns:w16="http://schemas.microsoft.com/office/word/2018/wordml" xmlns:w16cex="http://schemas.microsoft.com/office/word/2018/wordml/cex" xmlns:w16sdtdh="http://schemas.microsoft.com/office/word/2020/wordml/sdtdatahash" xmlns:wne="http://schemas.microsoft.com/office/word/2006/wordml" xmlns:wpg="http://schemas.microsoft.com/office/word/2010/wordprocessingGroup" xmlns:wps="http://schemas.microsoft.com/office/word/2010/wordprocessingShape">
   <w:p>
     <w:pPr>
       <w:keepNext w:val="0"/>
       <w:keepLines w:val="0"/>
       <w:pageBreakBefore w:val="0"/>
-      <w:widowControl w:val="1"/>
+      <w:widowControl/>
       <w:pBdr>
-        <w:top w:space="0" w:sz="0" w:val="nil"/>
-        <w:left w:space="0" w:sz="0" w:val="nil"/>
-        <w:bottom w:space="0" w:sz="0" w:val="nil"/>
-        <w:right w:space="0" w:sz="0" w:val="nil"/>
-        <w:between w:space="0" w:sz="0" w:val="nil"/>
+        <w:top w:val="nil"/>
+        <w:left w:val="nil"/>
+        <w:bottom w:val="nil"/>
+        <w:right w:val="nil"/>
+        <w:between w:val="nil"/>
       </w:pBdr>
-      <w:shd w:fill="auto" w:val="clear"/>
+      <w:shd w:val="clear"/>
       <w:tabs>
         <w:tab w:val="center" w:pos="4680"/>
         <w:tab w:val="right" w:pos="9360"/>
       </w:tabs>
-      <w:spacing w:after="0" w:before="0" w:line="240" w:lineRule="auto"/>
-      <w:ind w:left="0" w:right="0" w:firstLine="0"/>
+      <w:spacing w:before="0" w:after="0" w:line="240" w:lineRule="auto"/>
+      <w:ind w:left="0" w:right="0"/>
       <w:jc w:val="right"/>
       <w:rPr>
-        <w:rFonts w:ascii="Cambria" w:cs="Cambria" w:eastAsia="Cambria" w:hAnsi="Cambria"/>
+        <w:rFonts w:ascii="Cambria" w:hAnsi="Cambria" w:eastAsia="Cambria" w:cs="Cambria"/>
         <w:b w:val="0"/>
         <w:i w:val="0"/>
         <w:smallCaps w:val="0"/>
@@ -734,13 +658,12 @@
         <w:sz w:val="24"/>
         <w:szCs w:val="24"/>
         <w:u w:val="none"/>
-        <w:shd w:fill="auto" w:val="clear"/>
-        <w:vertAlign w:val="baseline"/>
+        <w:shd w:val="clear"/>
       </w:rPr>
     </w:pPr>
     <w:r>
       <w:rPr>
-        <w:rFonts w:ascii="Cambria" w:cs="Cambria" w:eastAsia="Cambria" w:hAnsi="Cambria"/>
+        <w:rFonts w:ascii="Cambria" w:hAnsi="Cambria" w:eastAsia="Cambria" w:cs="Cambria"/>
         <w:b w:val="0"/>
         <w:i w:val="0"/>
         <w:smallCaps w:val="0"/>
@@ -749,16 +672,15 @@
         <w:sz w:val="24"/>
         <w:szCs w:val="24"/>
         <w:u w:val="none"/>
-        <w:shd w:fill="auto" w:val="clear"/>
-        <w:vertAlign w:val="baseline"/>
+        <w:shd w:val="clear"/>
         <w:rtl w:val="0"/>
       </w:rPr>
       <w:t xml:space="preserve">Page </w:t>
     </w:r>
     <w:r>
       <w:rPr>
-        <w:rFonts w:ascii="Cambria" w:cs="Cambria" w:eastAsia="Cambria" w:hAnsi="Cambria"/>
-        <w:b w:val="1"/>
+        <w:rFonts w:ascii="Cambria" w:hAnsi="Cambria" w:eastAsia="Cambria" w:cs="Cambria"/>
+        <w:b/>
         <w:i w:val="0"/>
         <w:smallCaps w:val="0"/>
         <w:strike w:val="0"/>
@@ -766,17 +688,58 @@
         <w:sz w:val="24"/>
         <w:szCs w:val="24"/>
         <w:u w:val="none"/>
-        <w:shd w:fill="auto" w:val="clear"/>
-        <w:vertAlign w:val="baseline"/>
+        <w:shd w:val="clear"/>
       </w:rPr>
       <w:fldChar w:fldCharType="begin"/>
-      <w:instrText xml:space="preserve">PAGE</w:instrText>
+    </w:r>
+    <w:r>
+      <w:rPr>
+        <w:rFonts w:ascii="Cambria" w:hAnsi="Cambria" w:eastAsia="Cambria" w:cs="Cambria"/>
+        <w:b/>
+        <w:i w:val="0"/>
+        <w:smallCaps w:val="0"/>
+        <w:strike w:val="0"/>
+        <w:color w:val="000000"/>
+        <w:sz w:val="24"/>
+        <w:szCs w:val="24"/>
+        <w:u w:val="none"/>
+        <w:shd w:val="clear"/>
+      </w:rPr>
+      <w:instrText>PAGE</w:instrText>
+    </w:r>
+    <w:r>
+      <w:rPr>
+        <w:rFonts w:ascii="Cambria" w:hAnsi="Cambria" w:eastAsia="Cambria" w:cs="Cambria"/>
+        <w:b/>
+        <w:i w:val="0"/>
+        <w:smallCaps w:val="0"/>
+        <w:strike w:val="0"/>
+        <w:color w:val="000000"/>
+        <w:sz w:val="24"/>
+        <w:szCs w:val="24"/>
+        <w:u w:val="none"/>
+        <w:shd w:val="clear"/>
+      </w:rPr>
       <w:fldChar w:fldCharType="separate"/>
+    </w:r>
+    <w:r>
+      <w:rPr>
+        <w:rFonts w:ascii="Cambria" w:hAnsi="Cambria" w:eastAsia="Cambria" w:cs="Cambria"/>
+        <w:b/>
+        <w:i w:val="0"/>
+        <w:smallCaps w:val="0"/>
+        <w:strike w:val="0"/>
+        <w:color w:val="000000"/>
+        <w:sz w:val="24"/>
+        <w:szCs w:val="24"/>
+        <w:u w:val="none"/>
+        <w:shd w:val="clear"/>
+      </w:rPr>
       <w:fldChar w:fldCharType="end"/>
     </w:r>
     <w:r>
       <w:rPr>
-        <w:rFonts w:ascii="Cambria" w:cs="Cambria" w:eastAsia="Cambria" w:hAnsi="Cambria"/>
+        <w:rFonts w:ascii="Cambria" w:hAnsi="Cambria" w:eastAsia="Cambria" w:cs="Cambria"/>
         <w:b w:val="0"/>
         <w:i w:val="0"/>
         <w:smallCaps w:val="0"/>
@@ -785,16 +748,15 @@
         <w:sz w:val="24"/>
         <w:szCs w:val="24"/>
         <w:u w:val="none"/>
-        <w:shd w:fill="auto" w:val="clear"/>
-        <w:vertAlign w:val="baseline"/>
+        <w:shd w:val="clear"/>
         <w:rtl w:val="0"/>
       </w:rPr>
       <w:t xml:space="preserve"> of </w:t>
     </w:r>
     <w:r>
       <w:rPr>
-        <w:rFonts w:ascii="Cambria" w:cs="Cambria" w:eastAsia="Cambria" w:hAnsi="Cambria"/>
-        <w:b w:val="1"/>
+        <w:rFonts w:ascii="Cambria" w:hAnsi="Cambria" w:eastAsia="Cambria" w:cs="Cambria"/>
+        <w:b/>
         <w:i w:val="0"/>
         <w:smallCaps w:val="0"/>
         <w:strike w:val="0"/>
@@ -802,12 +764,53 @@
         <w:sz w:val="24"/>
         <w:szCs w:val="24"/>
         <w:u w:val="none"/>
-        <w:shd w:fill="auto" w:val="clear"/>
-        <w:vertAlign w:val="baseline"/>
+        <w:shd w:val="clear"/>
       </w:rPr>
       <w:fldChar w:fldCharType="begin"/>
-      <w:instrText xml:space="preserve">NUMPAGES</w:instrText>
+    </w:r>
+    <w:r>
+      <w:rPr>
+        <w:rFonts w:ascii="Cambria" w:hAnsi="Cambria" w:eastAsia="Cambria" w:cs="Cambria"/>
+        <w:b/>
+        <w:i w:val="0"/>
+        <w:smallCaps w:val="0"/>
+        <w:strike w:val="0"/>
+        <w:color w:val="000000"/>
+        <w:sz w:val="24"/>
+        <w:szCs w:val="24"/>
+        <w:u w:val="none"/>
+        <w:shd w:val="clear"/>
+      </w:rPr>
+      <w:instrText>NUMPAGES</w:instrText>
+    </w:r>
+    <w:r>
+      <w:rPr>
+        <w:rFonts w:ascii="Cambria" w:hAnsi="Cambria" w:eastAsia="Cambria" w:cs="Cambria"/>
+        <w:b/>
+        <w:i w:val="0"/>
+        <w:smallCaps w:val="0"/>
+        <w:strike w:val="0"/>
+        <w:color w:val="000000"/>
+        <w:sz w:val="24"/>
+        <w:szCs w:val="24"/>
+        <w:u w:val="none"/>
+        <w:shd w:val="clear"/>
+      </w:rPr>
       <w:fldChar w:fldCharType="separate"/>
+    </w:r>
+    <w:r>
+      <w:rPr>
+        <w:rFonts w:ascii="Cambria" w:hAnsi="Cambria" w:eastAsia="Cambria" w:cs="Cambria"/>
+        <w:b/>
+        <w:i w:val="0"/>
+        <w:smallCaps w:val="0"/>
+        <w:strike w:val="0"/>
+        <w:color w:val="000000"/>
+        <w:sz w:val="24"/>
+        <w:szCs w:val="24"/>
+        <w:u w:val="none"/>
+        <w:shd w:val="clear"/>
+      </w:rPr>
       <w:fldChar w:fldCharType="end"/>
     </w:r>
     <w:r>
@@ -821,24 +824,24 @@
       <w:keepNext w:val="0"/>
       <w:keepLines w:val="0"/>
       <w:pageBreakBefore w:val="0"/>
-      <w:widowControl w:val="1"/>
+      <w:widowControl/>
       <w:pBdr>
-        <w:top w:space="0" w:sz="0" w:val="nil"/>
-        <w:left w:space="0" w:sz="0" w:val="nil"/>
-        <w:bottom w:space="0" w:sz="0" w:val="nil"/>
-        <w:right w:space="0" w:sz="0" w:val="nil"/>
-        <w:between w:space="0" w:sz="0" w:val="nil"/>
+        <w:top w:val="nil"/>
+        <w:left w:val="nil"/>
+        <w:bottom w:val="nil"/>
+        <w:right w:val="nil"/>
+        <w:between w:val="nil"/>
       </w:pBdr>
-      <w:shd w:fill="auto" w:val="clear"/>
+      <w:shd w:val="clear"/>
       <w:tabs>
         <w:tab w:val="center" w:pos="4680"/>
         <w:tab w:val="right" w:pos="9360"/>
       </w:tabs>
-      <w:spacing w:after="0" w:before="0" w:line="240" w:lineRule="auto"/>
-      <w:ind w:left="0" w:right="0" w:firstLine="0"/>
+      <w:spacing w:before="0" w:after="0" w:line="240" w:lineRule="auto"/>
+      <w:ind w:left="0" w:right="0"/>
       <w:jc w:val="left"/>
       <w:rPr>
-        <w:rFonts w:ascii="Cambria" w:cs="Cambria" w:eastAsia="Cambria" w:hAnsi="Cambria"/>
+        <w:rFonts w:ascii="Cambria" w:hAnsi="Cambria" w:eastAsia="Cambria" w:cs="Cambria"/>
         <w:b w:val="0"/>
         <w:i w:val="0"/>
         <w:smallCaps w:val="0"/>
@@ -847,8 +850,7 @@
         <w:sz w:val="24"/>
         <w:szCs w:val="24"/>
         <w:u w:val="none"/>
-        <w:shd w:fill="auto" w:val="clear"/>
-        <w:vertAlign w:val="baseline"/>
+        <w:shd w:val="clear"/>
       </w:rPr>
     </w:pPr>
     <w:r>
@@ -861,30 +863,30 @@
 </file>
 
 <file path=word/header1.xml><?xml version="1.0" encoding="utf-8"?>
-<w:hdr xmlns:mc="http://schemas.openxmlformats.org/markup-compatibility/2006" xmlns:o="urn:schemas-microsoft-com:office:office" xmlns:r="http://schemas.openxmlformats.org/officeDocument/2006/relationships" xmlns:m="http://schemas.openxmlformats.org/officeDocument/2006/math" xmlns:v="urn:schemas-microsoft-com:vml" xmlns:wp="http://schemas.openxmlformats.org/drawingml/2006/wordprocessingDrawing" xmlns:w10="urn:schemas-microsoft-com:office:word" xmlns:w="http://schemas.openxmlformats.org/wordprocessingml/2006/main" xmlns:wne="http://schemas.microsoft.com/office/word/2006/wordml" xmlns:sl="http://schemas.openxmlformats.org/schemaLibrary/2006/main" xmlns:a="http://schemas.openxmlformats.org/drawingml/2006/main" xmlns:pic="http://schemas.openxmlformats.org/drawingml/2006/picture" xmlns:c="http://schemas.openxmlformats.org/drawingml/2006/chart" xmlns:lc="http://schemas.openxmlformats.org/drawingml/2006/lockedCanvas" xmlns:dgm="http://schemas.openxmlformats.org/drawingml/2006/diagram" xmlns:wps="http://schemas.microsoft.com/office/word/2010/wordprocessingShape" xmlns:wpg="http://schemas.microsoft.com/office/word/2010/wordprocessingGroup" xmlns:w14="http://schemas.microsoft.com/office/word/2010/wordml" xmlns:w15="http://schemas.microsoft.com/office/word/2012/wordml">
+<w:hdr xmlns:wpc="http://schemas.microsoft.com/office/word/2010/wordprocessingCanvas" xmlns:mc="http://schemas.openxmlformats.org/markup-compatibility/2006" xmlns:o="urn:schemas-microsoft-com:office:office" xmlns:r="http://schemas.openxmlformats.org/officeDocument/2006/relationships" xmlns:m="http://schemas.openxmlformats.org/officeDocument/2006/math" xmlns:v="urn:schemas-microsoft-com:vml" xmlns:wp14="http://schemas.microsoft.com/office/word/2010/wordprocessingDrawing" xmlns:wp="http://schemas.openxmlformats.org/drawingml/2006/wordprocessingDrawing" xmlns:w10="urn:schemas-microsoft-com:office:word" xmlns:w="http://schemas.openxmlformats.org/wordprocessingml/2006/main" xmlns:w14="http://schemas.microsoft.com/office/word/2010/wordml" xmlns:w15="http://schemas.microsoft.com/office/word/2012/wordml" xmlns:w16se="http://schemas.microsoft.com/office/word/2015/wordml/symex" xmlns:w16cid="http://schemas.microsoft.com/office/word/2016/wordml/cid" xmlns:w16="http://schemas.microsoft.com/office/word/2018/wordml" xmlns:w16cex="http://schemas.microsoft.com/office/word/2018/wordml/cex" xmlns:w16sdtdh="http://schemas.microsoft.com/office/word/2020/wordml/sdtdatahash" xmlns:wne="http://schemas.microsoft.com/office/word/2006/wordml" xmlns:wpg="http://schemas.microsoft.com/office/word/2010/wordprocessingGroup" xmlns:wps="http://schemas.microsoft.com/office/word/2010/wordprocessingShape">
   <w:p>
     <w:pPr>
       <w:keepNext w:val="0"/>
       <w:keepLines w:val="0"/>
       <w:pageBreakBefore w:val="0"/>
-      <w:widowControl w:val="1"/>
+      <w:widowControl/>
       <w:pBdr>
-        <w:top w:space="0" w:sz="0" w:val="nil"/>
-        <w:left w:space="0" w:sz="0" w:val="nil"/>
-        <w:bottom w:space="0" w:sz="0" w:val="nil"/>
-        <w:right w:space="0" w:sz="0" w:val="nil"/>
-        <w:between w:space="0" w:sz="0" w:val="nil"/>
+        <w:top w:val="nil"/>
+        <w:left w:val="nil"/>
+        <w:bottom w:val="nil"/>
+        <w:right w:val="nil"/>
+        <w:between w:val="nil"/>
       </w:pBdr>
-      <w:shd w:fill="auto" w:val="clear"/>
+      <w:shd w:val="clear"/>
       <w:tabs>
         <w:tab w:val="center" w:pos="4680"/>
         <w:tab w:val="right" w:pos="9360"/>
       </w:tabs>
-      <w:spacing w:after="0" w:before="0" w:line="240" w:lineRule="auto"/>
-      <w:ind w:left="0" w:right="0" w:firstLine="0"/>
+      <w:spacing w:before="0" w:after="0" w:line="240" w:lineRule="auto"/>
+      <w:ind w:left="0" w:right="0"/>
       <w:jc w:val="right"/>
       <w:rPr>
-        <w:rFonts w:ascii="Cambria" w:cs="Cambria" w:eastAsia="Cambria" w:hAnsi="Cambria"/>
+        <w:rFonts w:ascii="Cambria" w:hAnsi="Cambria" w:eastAsia="Cambria" w:cs="Cambria"/>
         <w:b w:val="0"/>
         <w:i w:val="0"/>
         <w:smallCaps w:val="0"/>
@@ -893,14 +895,13 @@
         <w:sz w:val="24"/>
         <w:szCs w:val="24"/>
         <w:u w:val="none"/>
-        <w:shd w:fill="auto" w:val="clear"/>
-        <w:vertAlign w:val="baseline"/>
+        <w:shd w:val="clear"/>
       </w:rPr>
     </w:pPr>
     <w:r>
       <w:rPr>
-        <w:rFonts w:ascii="Cambria" w:cs="Cambria" w:eastAsia="Cambria" w:hAnsi="Cambria"/>
-        <w:b w:val="1"/>
+        <w:rFonts w:ascii="Cambria" w:hAnsi="Cambria" w:eastAsia="Cambria" w:cs="Cambria"/>
+        <w:b/>
         <w:i w:val="0"/>
         <w:smallCaps w:val="0"/>
         <w:strike w:val="0"/>
@@ -908,24 +909,25 @@
         <w:sz w:val="24"/>
         <w:szCs w:val="24"/>
         <w:u w:val="none"/>
-        <w:shd w:fill="auto" w:val="clear"/>
-        <w:vertAlign w:val="baseline"/>
+        <w:shd w:val="clear"/>
       </w:rPr>
       <w:drawing>
-        <wp:inline distB="0" distT="0" distL="0" distR="0">
+        <wp:inline distT="0" distB="0" distL="0" distR="0">
           <wp:extent cx="1019175" cy="1076325"/>
-          <wp:effectExtent b="0" l="0" r="0" t="0"/>
-          <wp:docPr descr="https://lh4.googleusercontent.com/5WK6ko4JsoZR4Am2OjQB0soxduUkd7nZmrbd_ma-cozrHxda2zsF98rT2PF-fevgVx8NV58frKesiZOoh1D6R6y3WxD-rLJoNzjNf6OeK4KyJGQDy2wytRwOEJ9d4bZzNJHSgwQa" id="42" name="image1.jpg"/>
-          <a:graphic>
+          <wp:effectExtent l="0" t="0" r="0" b="0"/>
+          <wp:docPr id="42" name="image2.jpeg" descr="https://lh4.googleusercontent.com/5WK6ko4JsoZR4Am2OjQB0soxduUkd7nZmrbd_ma-cozrHxda2zsF98rT2PF-fevgVx8NV58frKesiZOoh1D6R6y3WxD-rLJoNzjNf6OeK4KyJGQDy2wytRwOEJ9d4bZzNJHSgwQa"/>
+          <wp:cNvGraphicFramePr>
+            <a:graphicFrameLocks xmlns:a="http://schemas.openxmlformats.org/drawingml/2006/main" noChangeAspect="1"/>
+          </wp:cNvGraphicFramePr>
+          <a:graphic xmlns:a="http://schemas.openxmlformats.org/drawingml/2006/main">
             <a:graphicData uri="http://schemas.openxmlformats.org/drawingml/2006/picture">
-              <pic:pic>
+              <pic:pic xmlns:pic="http://schemas.openxmlformats.org/drawingml/2006/picture">
                 <pic:nvPicPr>
-                  <pic:cNvPr descr="https://lh4.googleusercontent.com/5WK6ko4JsoZR4Am2OjQB0soxduUkd7nZmrbd_ma-cozrHxda2zsF98rT2PF-fevgVx8NV58frKesiZOoh1D6R6y3WxD-rLJoNzjNf6OeK4KyJGQDy2wytRwOEJ9d4bZzNJHSgwQa" id="0" name="image1.jpg"/>
-                  <pic:cNvPicPr preferRelativeResize="0"/>
+                  <pic:cNvPr id="42" name="image2.jpeg" descr="https://lh4.googleusercontent.com/5WK6ko4JsoZR4Am2OjQB0soxduUkd7nZmrbd_ma-cozrHxda2zsF98rT2PF-fevgVx8NV58frKesiZOoh1D6R6y3WxD-rLJoNzjNf6OeK4KyJGQDy2wytRwOEJ9d4bZzNJHSgwQa"/>
+                  <pic:cNvPicPr/>
                 </pic:nvPicPr>
                 <pic:blipFill>
-                  <a:blip r:embed="rId1"/>
-                  <a:srcRect b="0" l="0" r="0" t="0"/>
+                  <a:blip r:embed="rId2"/>
                   <a:stretch>
                     <a:fillRect/>
                   </a:stretch>
@@ -935,8 +937,9 @@
                     <a:off x="0" y="0"/>
                     <a:ext cx="1019175" cy="1076325"/>
                   </a:xfrm>
-                  <a:prstGeom prst="rect"/>
-                  <a:ln/>
+                  <a:prstGeom prst="rect">
+                    <a:avLst/>
+                  </a:prstGeom>
                 </pic:spPr>
               </pic:pic>
             </a:graphicData>

</xml_diff>

<commit_message>
update project status form with detailed dataset description and meeting information
</commit_message>
<xml_diff>
--- a/AAI-500 Final Team Project Status Update Form.docx
+++ b/AAI-500 Final Team Project Status Update Form.docx
@@ -332,65 +332,7 @@
           <w:sz w:val="24"/>
           <w:szCs w:val="24"/>
         </w:rPr>
-        <w:t>___________________________________________________________________________</w:t>
-      </w:r>
-    </w:p>
-    <w:p>
-      <w:pPr>
-        <w:spacing w:line="276" w:lineRule="auto"/>
-        <w:rPr>
-          <w:rFonts w:ascii="Times New Roman" w:hAnsi="Times New Roman" w:eastAsia="Times New Roman" w:cs="Times New Roman"/>
-        </w:rPr>
-      </w:pPr>
-      <w:r>
-        <w:rPr>
-          <w:rtl w:val="0"/>
-        </w:rPr>
-      </w:r>
-    </w:p>
-    <w:p>
-      <w:pPr>
-        <w:spacing w:line="276" w:lineRule="auto"/>
-        <w:rPr>
-          <w:rFonts w:ascii="Times New Roman" w:hAnsi="Times New Roman" w:eastAsia="Times New Roman" w:cs="Times New Roman"/>
-        </w:rPr>
-      </w:pPr>
-      <w:r>
-        <w:rPr>
-          <w:rFonts w:ascii="Times New Roman" w:hAnsi="Times New Roman" w:eastAsia="Times New Roman" w:cs="Times New Roman"/>
-          <w:sz w:val="24"/>
-          <w:szCs w:val="24"/>
-        </w:rPr>
-        <w:t>___________________________________________________________________________</w:t>
-      </w:r>
-    </w:p>
-    <w:p>
-      <w:pPr>
-        <w:spacing w:line="276" w:lineRule="auto"/>
-        <w:rPr>
-          <w:rFonts w:ascii="Times New Roman" w:hAnsi="Times New Roman" w:eastAsia="Times New Roman" w:cs="Times New Roman"/>
-        </w:rPr>
-      </w:pPr>
-      <w:r>
-        <w:rPr>
-          <w:rtl w:val="0"/>
-        </w:rPr>
-      </w:r>
-    </w:p>
-    <w:p>
-      <w:pPr>
-        <w:spacing w:line="276" w:lineRule="auto"/>
-        <w:rPr>
-          <w:rFonts w:ascii="Times New Roman" w:hAnsi="Times New Roman" w:eastAsia="Times New Roman" w:cs="Times New Roman"/>
-        </w:rPr>
-      </w:pPr>
-      <w:r>
-        <w:rPr>
-          <w:rFonts w:ascii="Times New Roman" w:hAnsi="Times New Roman" w:eastAsia="Times New Roman" w:cs="Times New Roman"/>
-          <w:sz w:val="24"/>
-          <w:szCs w:val="24"/>
-        </w:rPr>
-        <w:t>___________________________________________________________________________</w:t>
+        <w:t>The AI4I 2020 Predictive Maintenance Dataset (UCI ML Repository, id 601), donated by Stephan Matzka, is a synthetic dataset simulating industrial sensor data. It contains 10,000 records and 12 modeling features (after dropping the two identifier columns), including process readings (air/process temperature, rotational speed, torque, tool wear) and a binary target, Machine failure, plus five sub-failure-mode flags. The dataset is licensed CC BY 4.0.</w:t>
       </w:r>
     </w:p>
     <w:p>
@@ -423,7 +365,15 @@
           <w:sz w:val="24"/>
           <w:szCs w:val="24"/>
         </w:rPr>
-        <w:t>Are you using and practicing GitHub as a code hosting platform for version control and collaboration? If yes, provide the link here: _______________________</w:t>
+        <w:t xml:space="preserve">Are you using and practicing GitHub as a code hosting platform for version control and collaboration? If yes, provide the link here: Yes, </w:t>
+      </w:r>
+      <w:r>
+        <w:rPr>
+          <w:rFonts w:ascii="Times New Roman" w:cs="Times New Roman"/>
+          <w:sz w:val="24"/>
+          <w:szCs w:val="24"/>
+        </w:rPr>
+        <w:t>https://github.com/JustinSu11/AAI_500_Final.git</w:t>
       </w:r>
     </w:p>
     <w:p>
@@ -452,7 +402,7 @@
           <w:sz w:val="24"/>
           <w:szCs w:val="24"/>
         </w:rPr>
-        <w:t>How many times have your members met in the last two weeks? _______________________</w:t>
+        <w:t>How many times have your members met in the last two weeks? 4</w:t>
       </w:r>
     </w:p>
     <w:p>
@@ -525,7 +475,7 @@
           <w:sz w:val="24"/>
           <w:szCs w:val="24"/>
         </w:rPr>
-        <w:t>? ___________________</w:t>
+        <w:t>? Text and no project management software</w:t>
       </w:r>
     </w:p>
     <w:p>
@@ -927,7 +877,7 @@
                   <pic:cNvPicPr/>
                 </pic:nvPicPr>
                 <pic:blipFill>
-                  <a:blip r:embed="rId2"/>
+                  <a:blip r:embed="rId3"/>
                   <a:stretch>
                     <a:fillRect/>
                   </a:stretch>

</xml_diff>

<commit_message>
update project status form to reflect challenges faced by team members
</commit_message>
<xml_diff>
--- a/AAI-500 Final Team Project Status Update Form.docx
+++ b/AAI-500 Final Team Project Status Update Form.docx
@@ -369,7 +369,7 @@
       </w:r>
       <w:r>
         <w:rPr>
-          <w:rFonts w:ascii="Times New Roman" w:cs="Times New Roman"/>
+          <w:rFonts w:ascii="Times New Roman" w:hAnsi="Cambria" w:eastAsia="Cambria" w:cs="Times New Roman"/>
           <w:sz w:val="24"/>
           <w:szCs w:val="24"/>
         </w:rPr>
@@ -504,66 +504,16 @@
           <w:sz w:val="24"/>
           <w:szCs w:val="24"/>
         </w:rPr>
-        <w:t>Comments/ Roadblocks: _______________________________________________________</w:t>
-      </w:r>
-    </w:p>
-    <w:p>
-      <w:pPr>
-        <w:spacing w:line="276" w:lineRule="auto"/>
-        <w:rPr>
-          <w:rFonts w:ascii="Times New Roman" w:hAnsi="Times New Roman" w:eastAsia="Times New Roman" w:cs="Times New Roman"/>
-        </w:rPr>
-      </w:pPr>
-      <w:r>
-        <w:rPr>
-          <w:rtl w:val="0"/>
-        </w:rPr>
-      </w:r>
-    </w:p>
-    <w:p>
-      <w:pPr>
-        <w:spacing w:line="276" w:lineRule="auto"/>
-        <w:rPr>
-          <w:rFonts w:ascii="Times New Roman" w:hAnsi="Times New Roman" w:eastAsia="Times New Roman" w:cs="Times New Roman"/>
-        </w:rPr>
-      </w:pPr>
-      <w:r>
-        <w:rPr>
-          <w:rFonts w:ascii="Times New Roman" w:hAnsi="Times New Roman" w:eastAsia="Times New Roman" w:cs="Times New Roman"/>
-          <w:sz w:val="24"/>
-          <w:szCs w:val="24"/>
-        </w:rPr>
-        <w:t>___________________________________________________________________________</w:t>
-      </w:r>
-    </w:p>
-    <w:p>
-      <w:pPr>
-        <w:spacing w:line="276" w:lineRule="auto"/>
-        <w:rPr>
-          <w:rFonts w:ascii="Times New Roman" w:hAnsi="Times New Roman" w:eastAsia="Times New Roman" w:cs="Times New Roman"/>
-        </w:rPr>
-      </w:pPr>
-      <w:r>
-        <w:rPr>
-          <w:rtl w:val="0"/>
-        </w:rPr>
-      </w:r>
-    </w:p>
-    <w:p>
-      <w:pPr>
-        <w:spacing w:line="276" w:lineRule="auto"/>
-        <w:rPr>
-          <w:rFonts w:ascii="Times New Roman" w:hAnsi="Times New Roman" w:eastAsia="Times New Roman" w:cs="Times New Roman"/>
-        </w:rPr>
-      </w:pPr>
-      <w:r>
-        <w:rPr>
-          <w:rFonts w:ascii="Times New Roman" w:hAnsi="Times New Roman" w:eastAsia="Times New Roman" w:cs="Times New Roman"/>
-          <w:sz w:val="24"/>
-          <w:szCs w:val="24"/>
-        </w:rPr>
-        <w:t>___________________________________________________________________________</w:t>
-      </w:r>
+        <w:t>Comments/ Roadblocks: Having no experience in this type of project made it hard to jump into.</w:t>
+      </w:r>
+    </w:p>
+    <w:p>
+      <w:pPr>
+        <w:spacing w:line="276" w:lineRule="auto"/>
+        <w:rPr>
+          <w:rFonts w:ascii="Times New Roman" w:hAnsi="Times New Roman" w:eastAsia="Times New Roman" w:cs="Times New Roman"/>
+        </w:rPr>
+      </w:pPr>
     </w:p>
     <w:sectPr>
       <w:headerReference w:type="default" r:id="rId9"/>
@@ -865,7 +815,7 @@
         <wp:inline distT="0" distB="0" distL="0" distR="0">
           <wp:extent cx="1019175" cy="1076325"/>
           <wp:effectExtent l="0" t="0" r="0" b="0"/>
-          <wp:docPr id="42" name="image2.jpeg" descr="https://lh4.googleusercontent.com/5WK6ko4JsoZR4Am2OjQB0soxduUkd7nZmrbd_ma-cozrHxda2zsF98rT2PF-fevgVx8NV58frKesiZOoh1D6R6y3WxD-rLJoNzjNf6OeK4KyJGQDy2wytRwOEJ9d4bZzNJHSgwQa"/>
+          <wp:docPr id="42" name="image3.jpeg" descr="https://lh4.googleusercontent.com/5WK6ko4JsoZR4Am2OjQB0soxduUkd7nZmrbd_ma-cozrHxda2zsF98rT2PF-fevgVx8NV58frKesiZOoh1D6R6y3WxD-rLJoNzjNf6OeK4KyJGQDy2wytRwOEJ9d4bZzNJHSgwQa"/>
           <wp:cNvGraphicFramePr>
             <a:graphicFrameLocks xmlns:a="http://schemas.openxmlformats.org/drawingml/2006/main" noChangeAspect="1"/>
           </wp:cNvGraphicFramePr>
@@ -873,11 +823,11 @@
             <a:graphicData uri="http://schemas.openxmlformats.org/drawingml/2006/picture">
               <pic:pic xmlns:pic="http://schemas.openxmlformats.org/drawingml/2006/picture">
                 <pic:nvPicPr>
-                  <pic:cNvPr id="42" name="image2.jpeg" descr="https://lh4.googleusercontent.com/5WK6ko4JsoZR4Am2OjQB0soxduUkd7nZmrbd_ma-cozrHxda2zsF98rT2PF-fevgVx8NV58frKesiZOoh1D6R6y3WxD-rLJoNzjNf6OeK4KyJGQDy2wytRwOEJ9d4bZzNJHSgwQa"/>
+                  <pic:cNvPr id="42" name="image3.jpeg" descr="https://lh4.googleusercontent.com/5WK6ko4JsoZR4Am2OjQB0soxduUkd7nZmrbd_ma-cozrHxda2zsF98rT2PF-fevgVx8NV58frKesiZOoh1D6R6y3WxD-rLJoNzjNf6OeK4KyJGQDy2wytRwOEJ9d4bZzNJHSgwQa"/>
                   <pic:cNvPicPr/>
                 </pic:nvPicPr>
                 <pic:blipFill>
-                  <a:blip r:embed="rId3"/>
+                  <a:blip r:embed="rId4"/>
                   <a:stretch>
                     <a:fillRect/>
                   </a:stretch>

</xml_diff>